<commit_message>
Update diagrams to the v0.5 GDD and fix more GDD contradictions
Class diagram adds body types, fighting styles, attribute caps, venues
and the Referee Mode classes; new sequence and state diagrams cover a
referee penalty call and the referee rating. The GDD gains the knockdown
count, head values for side kicks, Referee Mode in the main menu and the
missing Future items, and treats stalling as a penalty.
</commit_message>
<xml_diff>
--- a/Docs/GDD_Open_Stance.docx
+++ b/Docs/GDD_Open_Stance.docx
@@ -607,7 +607,7 @@
             <w:noProof/>
             <w:webHidden/>
           </w:rPr>
-          <w:t>59</w:t>
+          <w:t>60</w:t>
         </w:r>
         <w:r>
           <w:rPr>
@@ -5166,7 +5166,7 @@
             <w:noProof/>
             <w:webHidden/>
           </w:rPr>
-          <w:t>36</w:t>
+          <w:t>37</w:t>
         </w:r>
         <w:r>
           <w:rPr>
@@ -5394,7 +5394,7 @@
             <w:noProof/>
             <w:webHidden/>
           </w:rPr>
-          <w:t>37</w:t>
+          <w:t>38</w:t>
         </w:r>
         <w:r>
           <w:rPr>
@@ -5534,7 +5534,7 @@
             <w:noProof/>
             <w:webHidden/>
           </w:rPr>
-          <w:t>39</w:t>
+          <w:t>40</w:t>
         </w:r>
         <w:r>
           <w:rPr>
@@ -5604,7 +5604,7 @@
             <w:noProof/>
             <w:webHidden/>
           </w:rPr>
-          <w:t>39</w:t>
+          <w:t>40</w:t>
         </w:r>
         <w:r>
           <w:rPr>
@@ -5674,7 +5674,7 @@
             <w:noProof/>
             <w:webHidden/>
           </w:rPr>
-          <w:t>39</w:t>
+          <w:t>40</w:t>
         </w:r>
         <w:r>
           <w:rPr>
@@ -5744,7 +5744,7 @@
             <w:noProof/>
             <w:webHidden/>
           </w:rPr>
-          <w:t>40</w:t>
+          <w:t>41</w:t>
         </w:r>
         <w:r>
           <w:rPr>
@@ -5814,7 +5814,7 @@
             <w:noProof/>
             <w:webHidden/>
           </w:rPr>
-          <w:t>40</w:t>
+          <w:t>41</w:t>
         </w:r>
         <w:r>
           <w:rPr>
@@ -5884,7 +5884,7 @@
             <w:noProof/>
             <w:webHidden/>
           </w:rPr>
-          <w:t>41</w:t>
+          <w:t>42</w:t>
         </w:r>
         <w:r>
           <w:rPr>
@@ -5954,7 +5954,7 @@
             <w:noProof/>
             <w:webHidden/>
           </w:rPr>
-          <w:t>41</w:t>
+          <w:t>42</w:t>
         </w:r>
         <w:r>
           <w:rPr>
@@ -6024,7 +6024,7 @@
             <w:noProof/>
             <w:webHidden/>
           </w:rPr>
-          <w:t>41</w:t>
+          <w:t>42</w:t>
         </w:r>
         <w:r>
           <w:rPr>
@@ -6094,7 +6094,7 @@
             <w:noProof/>
             <w:webHidden/>
           </w:rPr>
-          <w:t>41</w:t>
+          <w:t>42</w:t>
         </w:r>
         <w:r>
           <w:rPr>
@@ -6164,7 +6164,7 @@
             <w:noProof/>
             <w:webHidden/>
           </w:rPr>
-          <w:t>42</w:t>
+          <w:t>43</w:t>
         </w:r>
         <w:r>
           <w:rPr>
@@ -6234,7 +6234,7 @@
             <w:noProof/>
             <w:webHidden/>
           </w:rPr>
-          <w:t>43</w:t>
+          <w:t>44</w:t>
         </w:r>
         <w:r>
           <w:rPr>
@@ -6304,7 +6304,7 @@
             <w:noProof/>
             <w:webHidden/>
           </w:rPr>
-          <w:t>43</w:t>
+          <w:t>44</w:t>
         </w:r>
         <w:r>
           <w:rPr>
@@ -6374,7 +6374,7 @@
             <w:noProof/>
             <w:webHidden/>
           </w:rPr>
-          <w:t>43</w:t>
+          <w:t>44</w:t>
         </w:r>
         <w:r>
           <w:rPr>
@@ -6444,7 +6444,7 @@
             <w:noProof/>
             <w:webHidden/>
           </w:rPr>
-          <w:t>43</w:t>
+          <w:t>44</w:t>
         </w:r>
         <w:r>
           <w:rPr>
@@ -6523,7 +6523,7 @@
             <w:noProof/>
             <w:webHidden/>
           </w:rPr>
-          <w:t>45</w:t>
+          <w:t>46</w:t>
         </w:r>
         <w:r>
           <w:rPr>
@@ -6593,7 +6593,7 @@
             <w:noProof/>
             <w:webHidden/>
           </w:rPr>
-          <w:t>46</w:t>
+          <w:t>47</w:t>
         </w:r>
         <w:r>
           <w:rPr>
@@ -6663,7 +6663,7 @@
             <w:noProof/>
             <w:webHidden/>
           </w:rPr>
-          <w:t>47</w:t>
+          <w:t>48</w:t>
         </w:r>
         <w:r>
           <w:rPr>
@@ -6733,7 +6733,7 @@
             <w:noProof/>
             <w:webHidden/>
           </w:rPr>
-          <w:t>48</w:t>
+          <w:t>49</w:t>
         </w:r>
         <w:r>
           <w:rPr>
@@ -6803,7 +6803,7 @@
             <w:noProof/>
             <w:webHidden/>
           </w:rPr>
-          <w:t>49</w:t>
+          <w:t>50</w:t>
         </w:r>
         <w:r>
           <w:rPr>
@@ -6873,7 +6873,7 @@
             <w:noProof/>
             <w:webHidden/>
           </w:rPr>
-          <w:t>49</w:t>
+          <w:t>50</w:t>
         </w:r>
         <w:r>
           <w:rPr>
@@ -6943,7 +6943,7 @@
             <w:noProof/>
             <w:webHidden/>
           </w:rPr>
-          <w:t>49</w:t>
+          <w:t>50</w:t>
         </w:r>
         <w:r>
           <w:rPr>
@@ -7013,7 +7013,7 @@
             <w:noProof/>
             <w:webHidden/>
           </w:rPr>
-          <w:t>49</w:t>
+          <w:t>50</w:t>
         </w:r>
         <w:r>
           <w:rPr>
@@ -7083,7 +7083,7 @@
             <w:noProof/>
             <w:webHidden/>
           </w:rPr>
-          <w:t>50</w:t>
+          <w:t>51</w:t>
         </w:r>
         <w:r>
           <w:rPr>
@@ -7153,7 +7153,7 @@
             <w:noProof/>
             <w:webHidden/>
           </w:rPr>
-          <w:t>50</w:t>
+          <w:t>51</w:t>
         </w:r>
         <w:r>
           <w:rPr>
@@ -7223,7 +7223,7 @@
             <w:noProof/>
             <w:webHidden/>
           </w:rPr>
-          <w:t>51</w:t>
+          <w:t>52</w:t>
         </w:r>
         <w:r>
           <w:rPr>
@@ -7293,7 +7293,7 @@
             <w:noProof/>
             <w:webHidden/>
           </w:rPr>
-          <w:t>51</w:t>
+          <w:t>52</w:t>
         </w:r>
         <w:r>
           <w:rPr>
@@ -7363,7 +7363,7 @@
             <w:noProof/>
             <w:webHidden/>
           </w:rPr>
-          <w:t>51</w:t>
+          <w:t>52</w:t>
         </w:r>
         <w:r>
           <w:rPr>
@@ -7433,7 +7433,7 @@
             <w:noProof/>
             <w:webHidden/>
           </w:rPr>
-          <w:t>53</w:t>
+          <w:t>54</w:t>
         </w:r>
         <w:r>
           <w:rPr>
@@ -7503,7 +7503,7 @@
             <w:noProof/>
             <w:webHidden/>
           </w:rPr>
-          <w:t>53</w:t>
+          <w:t>54</w:t>
         </w:r>
         <w:r>
           <w:rPr>
@@ -7573,7 +7573,7 @@
             <w:noProof/>
             <w:webHidden/>
           </w:rPr>
-          <w:t>54</w:t>
+          <w:t>55</w:t>
         </w:r>
         <w:r>
           <w:rPr>
@@ -7643,7 +7643,7 @@
             <w:noProof/>
             <w:webHidden/>
           </w:rPr>
-          <w:t>54</w:t>
+          <w:t>55</w:t>
         </w:r>
         <w:r>
           <w:rPr>
@@ -7713,7 +7713,7 @@
             <w:noProof/>
             <w:webHidden/>
           </w:rPr>
-          <w:t>55</w:t>
+          <w:t>56</w:t>
         </w:r>
         <w:r>
           <w:rPr>
@@ -7783,7 +7783,7 @@
             <w:noProof/>
             <w:webHidden/>
           </w:rPr>
-          <w:t>56</w:t>
+          <w:t>57</w:t>
         </w:r>
         <w:r>
           <w:rPr>
@@ -7853,7 +7853,7 @@
             <w:noProof/>
             <w:webHidden/>
           </w:rPr>
-          <w:t>57</w:t>
+          <w:t>58</w:t>
         </w:r>
         <w:r>
           <w:rPr>
@@ -7923,7 +7923,7 @@
             <w:noProof/>
             <w:webHidden/>
           </w:rPr>
-          <w:t>57</w:t>
+          <w:t>58</w:t>
         </w:r>
         <w:r>
           <w:rPr>
@@ -7993,7 +7993,7 @@
             <w:noProof/>
             <w:webHidden/>
           </w:rPr>
-          <w:t>58</w:t>
+          <w:t>59</w:t>
         </w:r>
         <w:r>
           <w:rPr>
@@ -8063,7 +8063,7 @@
             <w:noProof/>
             <w:webHidden/>
           </w:rPr>
-          <w:t>58</w:t>
+          <w:t>59</w:t>
         </w:r>
         <w:r>
           <w:rPr>
@@ -9840,7 +9840,7 @@
                 <w:sz w:val="20"/>
                 <w:szCs w:val="20"/>
               </w:rPr>
-              <w:t xml:space="preserve">3. Master: harder AI, spinning and jumping kicks, clean matches without penalties. Career </w:t>
+              <w:t xml:space="preserve">3. Master: harder AI, spinning and jumping kicks, clean matches without penalties. Career (1.0) </w:t>
             </w:r>
             <w:r>
               <w:t xml:space="preserve">and Online </w:t>
@@ -16538,7 +16538,7 @@
           <w:sz w:val="20"/>
           <w:szCs w:val="20"/>
         </w:rPr>
-        <w:t>PLAN THE WEEK  →  TRAIN  →  GRADE OR COMPETE  →  REVIEW  →  LEVEL UP</w:t>
+        <w:t>PLAN THE WEEK  →  TRAIN  →  PREPARE  →  GRADE OR COMPETE  →  REVIEW  →  LEVEL UP</w:t>
       </w:r>
     </w:p>
     <w:p>
@@ -26064,7 +26064,7 @@
                 <w:sz w:val="20"/>
                 <w:szCs w:val="20"/>
               </w:rPr>
-              <w:t>Play (Sparring, Tournament; Challenges [Future]), Progress (Training; Career), Connected (Online and Replays) [Future], Customize, Options, Quit</w:t>
+              <w:t>Play (Sparring, Tournament; Challenges and Referee Mode [Future]), Progress (Training; Career), Connected (Online and Replays) [Future], Customize, Options, Quit</w:t>
             </w:r>
           </w:p>
         </w:tc>
@@ -30098,6 +30098,78 @@
               </w:rPr>
               <w:t>Penalty declared</w:t>
             </w:r>
+          </w:p>
+        </w:tc>
+      </w:tr>
+      <w:tr>
+        <w:trPr>
+          <w:cantSplit/>
+        </w:trPr>
+        <w:tc>
+          <w:tcPr>
+            <w:tcW w:w="2340" w:type="dxa"/>
+            <w:vAlign w:val="center"/>
+          </w:tcPr>
+          <w:p>
+            <w:pPr>
+              <w:spacing w:before="40" w:after="40"/>
+            </w:pPr>
+            <w:r>
+              <w:rPr>
+                <w:b/>
+                <w:bCs/>
+                <w:sz w:val="20"/>
+                <w:szCs w:val="20"/>
+              </w:rPr>
+              <w:t>HANA … YEODEOL</w:t>
+            </w:r>
+            <w:r>
+              <w:rPr>
+                <w:sz w:val="20"/>
+                <w:szCs w:val="20"/>
+              </w:rPr>
+              <w:t xml:space="preserve"> 하나 … 여덟</w:t>
+            </w:r>
+          </w:p>
+        </w:tc>
+        <w:tc>
+          <w:tcPr>
+            <w:tcW w:w="2340" w:type="dxa"/>
+            <w:vAlign w:val="center"/>
+          </w:tcPr>
+          <w:p>
+            <w:pPr>
+              <w:spacing w:before="40" w:after="40"/>
+            </w:pPr>
+            <w:r>
+              <w:rPr>
+                <w:sz w:val="20"/>
+                <w:szCs w:val="20"/>
+              </w:rPr>
+              <w:t>Knockdown count, one to eight</w:t>
+            </w:r>
+          </w:p>
+        </w:tc>
+        <w:tc>
+          <w:tcPr>
+            <w:tcW w:w="2340" w:type="dxa"/>
+            <w:vAlign w:val="center"/>
+          </w:tcPr>
+          <w:p>
+            <w:pPr>
+              <w:spacing w:before="40" w:after="40"/>
+            </w:pPr>
+          </w:p>
+        </w:tc>
+        <w:tc>
+          <w:tcPr>
+            <w:tcW w:w="2340" w:type="dxa"/>
+            <w:vAlign w:val="center"/>
+          </w:tcPr>
+          <w:p>
+            <w:pPr>
+              <w:spacing w:before="40" w:after="40"/>
+            </w:pPr>
           </w:p>
         </w:tc>
       </w:tr>
@@ -32804,7 +32876,7 @@
                 <w:sz w:val="20"/>
                 <w:szCs w:val="20"/>
               </w:rPr>
-              <w:t>Body · 2</w:t>
+              <w:t>Body · 2 / Head · 3</w:t>
             </w:r>
           </w:p>
         </w:tc>
@@ -32874,7 +32946,7 @@
                 <w:sz w:val="20"/>
                 <w:szCs w:val="20"/>
               </w:rPr>
-              <w:t>RS Up</w:t>
+              <w:t>RS Up; RB for the head</w:t>
             </w:r>
           </w:p>
         </w:tc>
@@ -32915,7 +32987,7 @@
                 <w:sz w:val="20"/>
                 <w:szCs w:val="20"/>
               </w:rPr>
-              <w:t>Body · 2</w:t>
+              <w:t>Body · 2 / Head · 3</w:t>
             </w:r>
           </w:p>
         </w:tc>
@@ -33040,7 +33112,7 @@
                 <w:sz w:val="20"/>
                 <w:szCs w:val="20"/>
               </w:rPr>
-              <w:t>RT + RS Up</w:t>
+              <w:t>RT + RS Up; RB for the head</w:t>
             </w:r>
           </w:p>
         </w:tc>
@@ -33192,7 +33264,7 @@
                 <w:sz w:val="20"/>
                 <w:szCs w:val="20"/>
               </w:rPr>
-              <w:t>Body · 2</w:t>
+              <w:t>Body · 2 / Head · 3</w:t>
             </w:r>
           </w:p>
         </w:tc>
@@ -33317,7 +33389,7 @@
                 <w:sz w:val="20"/>
                 <w:szCs w:val="20"/>
               </w:rPr>
-              <w:t>RT + RS Left/Right</w:t>
+              <w:t>RT + RS Left/Right; RB for the head</w:t>
             </w:r>
           </w:p>
         </w:tc>
@@ -36888,7 +36960,7 @@
         <w:spacing w:after="60"/>
       </w:pPr>
       <w:r>
-        <w:t xml:space="preserve">Career milestones: podium poses. Challenge medals and gear styles </w:t>
+        <w:t xml:space="preserve">Career milestones and challenges: podium poses, medals and gear styles (10.1) </w:t>
       </w:r>
       <w:r>
         <w:rPr>
@@ -37463,7 +37535,7 @@
                 <w:sz w:val="20"/>
                 <w:szCs w:val="20"/>
               </w:rPr>
-              <w:t>Clinch or stalling</w:t>
+              <w:t>Clinch</w:t>
             </w:r>
           </w:p>
         </w:tc>
@@ -37522,7 +37594,48 @@
                 <w:sz w:val="20"/>
                 <w:szCs w:val="20"/>
               </w:rPr>
-              <w:t>Stops play and declares gam-jeom toward the penalized fighter</w:t>
+              <w:t>Stops play with kal-yeo and declares gam-jeom toward the penalized fighter, including for stalling (8.4), then calls kye-sok</w:t>
+            </w:r>
+          </w:p>
+        </w:tc>
+      </w:tr>
+      <w:tr>
+        <w:trPr>
+          <w:cantSplit/>
+        </w:trPr>
+        <w:tc>
+          <w:tcPr>
+            <w:tcW w:w="2200" w:type="dxa"/>
+            <w:vAlign w:val="center"/>
+          </w:tcPr>
+          <w:p>
+            <w:pPr>
+              <w:spacing w:before="40" w:after="40"/>
+            </w:pPr>
+            <w:r>
+              <w:rPr>
+                <w:sz w:val="20"/>
+                <w:szCs w:val="20"/>
+              </w:rPr>
+              <w:t>Knockdown</w:t>
+            </w:r>
+          </w:p>
+        </w:tc>
+        <w:tc>
+          <w:tcPr>
+            <w:tcW w:w="7160" w:type="dxa"/>
+            <w:vAlign w:val="center"/>
+          </w:tcPr>
+          <w:p>
+            <w:pPr>
+              <w:spacing w:before="40" w:after="40"/>
+            </w:pPr>
+            <w:r>
+              <w:rPr>
+                <w:sz w:val="20"/>
+                <w:szCs w:val="20"/>
+              </w:rPr>
+              <w:t>Counts hana to yeodeol (one to eight) while the fighter gets up, then calls kye-sok</w:t>
             </w:r>
           </w:p>
         </w:tc>
@@ -41856,6 +41969,54 @@
                 <w:szCs w:val="20"/>
               </w:rPr>
               <w:t>Adaptive and shadow AI</w:t>
+            </w:r>
+          </w:p>
+          <w:p>
+            <w:pPr>
+              <w:spacing w:before="40" w:after="60"/>
+            </w:pPr>
+            <w:r>
+              <w:rPr>
+                <w:sz w:val="20"/>
+                <w:szCs w:val="20"/>
+              </w:rPr>
+              <w:t>Custom and historical rulesets (8.12)</w:t>
+            </w:r>
+          </w:p>
+          <w:p>
+            <w:pPr>
+              <w:spacing w:before="40" w:after="60"/>
+            </w:pPr>
+            <w:r>
+              <w:rPr>
+                <w:sz w:val="20"/>
+                <w:szCs w:val="20"/>
+              </w:rPr>
+              <w:t>Commentary (13)</w:t>
+            </w:r>
+          </w:p>
+          <w:p>
+            <w:pPr>
+              <w:spacing w:before="40" w:after="60"/>
+            </w:pPr>
+            <w:r>
+              <w:rPr>
+                <w:sz w:val="20"/>
+                <w:szCs w:val="20"/>
+              </w:rPr>
+              <w:t>Gear styles, dojang and ceremony customization (10.1)</w:t>
+            </w:r>
+          </w:p>
+          <w:p>
+            <w:pPr>
+              <w:spacing w:before="40" w:after="60"/>
+            </w:pPr>
+            <w:r>
+              <w:rPr>
+                <w:sz w:val="20"/>
+                <w:szCs w:val="20"/>
+              </w:rPr>
+              <w:t>Ageing, retirement, hall of fame and the world games (4.2, 4.4)</w:t>
             </w:r>
           </w:p>
           <w:p>
@@ -45064,7 +45225,7 @@
                 <w:sz w:val="20"/>
                 <w:szCs w:val="20"/>
               </w:rPr>
-              <w:t>Adds Referee Mode with its own controls and a referee rating (3.5, 3.5.1); body types with height and weight, fighting styles, an overall rating and an OVR 99 ceiling for every Career fighter (5.4.1 to 5.4.3). Fixes contradictions: multi-season Careers are part of 1.0, holding RB takes kicks but not punches to the head, punches register on the trunk protector, rivals switch style only between seasons, and the podium moment moves to the world series final. Gives every Career tournament tier its own venue (6.2).</w:t>
+              <w:t>Adds Referee Mode with its own controls and a referee rating (3.5, 3.5.1); body types with height and weight, fighting styles, an overall rating and an OVR 99 ceiling for every Career fighter (5.4.1 to 5.4.3). Fixes contradictions: multi-season Careers are part of 1.0, holding RB takes kicks but not punches to the head, punches register on the trunk protector, rivals switch style only between seasons, and the podium moment moves to the world series final. Gives every Career tournament tier its own venue (6.2). A second pass adds the knockdown count (8.5, 11.2), head values for side kicks (9.1), Referee Mode in the main menu (7.5) and the missing Future items (17).</w:t>
             </w:r>
           </w:p>
         </w:tc>

</xml_diff>

<commit_message>
Fix a cross-reference and two wording conflicts in the GDD
Points 1.8 at the Career and Online sections, stops 1.6 implying every
special kick is a stick circle, and calls the competition arena the
default Sparring and Tournament venue in 6.2.
</commit_message>
<xml_diff>
--- a/Docs/GDD_Open_Stance.docx
+++ b/Docs/GDD_Open_Stance.docx
@@ -9008,7 +9008,7 @@
     </w:p>
     <w:p>
       <w:r>
-        <w:t>A match is a series of short exchanges on an 8 m octagonal mat. Each fighter bounces in guard and manages distance with the left stick. The right stick, the Skill Stick, chooses the kick: up for a side or cut kick, left or right for a roundhouse or hook kick, and quarter and half circles for axe, spinning and tornado kicks. Holding RT kicks with the back leg, holding RB aims at the head, and holding LB fakes the attack. Hits score the way the electronic scoring system does: 1 point for a punch, 2 for a body kick, 3 for the head, 4 for a spinning body kick and 6 for a spinning head kick (8.3). Stamina limits how often a fighter throws big techniques. Players learn in the training dojang and spar the AI or a friend; Career then takes a created fighter from white belt at a local club to a world final, unlocking techniques rank by rank. The look is realistic: MetaHuman fighters in white doboks and blue or red gear, animated from motion capture of real practitioners.</w:t>
+        <w:t>A match is a series of short exchanges on an 8 m octagonal mat. Each fighter bounces in guard and manages distance with the left stick. The right stick, the Skill Stick, chooses the kick: up for a side or cut kick, left or right for a roundhouse or hook kick, and circles and other motions for axe, spinning and tornado kicks (7.2). Holding RT kicks with the back leg, holding RB aims at the head, and holding LB fakes the attack. Hits score the way the electronic scoring system does: 1 point for a punch, 2 for a body kick, 3 for the head, 4 for a spinning body kick and 6 for a spinning head kick (8.3). Stamina limits how often a fighter throws big techniques. Players learn in the training dojang and spar the AI or a friend; Career then takes a created fighter from white belt at a local club to a world final, unlocking techniques rank by rank. The look is realistic: MetaHuman fighters in white doboks and blue or red gear, animated from motion capture of real practitioners.</w:t>
       </w:r>
     </w:p>
     <w:p>
@@ -9854,7 +9854,7 @@
               <w:t>[Future]</w:t>
             </w:r>
             <w:r>
-              <w:t xml:space="preserve"> extend Compete and Master (section 2).</w:t>
+              <w:t xml:space="preserve"> extend Compete and Master (sections 4 and 12).</w:t>
             </w:r>
           </w:p>
         </w:tc>
@@ -21689,7 +21689,7 @@
                 <w:sz w:val="20"/>
                 <w:szCs w:val="20"/>
               </w:rPr>
-              <w:t>Sparring and local Tournament matches, and any Career event whose own venue is not built yet.</w:t>
+              <w:t>The default venue for Sparring and local Tournament matches, and for any Career event whose own venue is not built yet.</w:t>
             </w:r>
           </w:p>
         </w:tc>
@@ -45225,7 +45225,7 @@
                 <w:sz w:val="20"/>
                 <w:szCs w:val="20"/>
               </w:rPr>
-              <w:t>Adds Referee Mode with its own controls and a referee rating (3.5, 3.5.1); body types with height and weight, fighting styles, an overall rating and an OVR 99 ceiling for every Career fighter (5.4.1 to 5.4.3). Fixes contradictions: multi-season Careers are part of 1.0, holding RB takes kicks but not punches to the head, punches register on the trunk protector, rivals switch style only between seasons, and the podium moment moves to the world series final. Gives every Career tournament tier its own venue (6.2). A second pass adds the knockdown count (8.5, 11.2), head values for side kicks (9.1), Referee Mode in the main menu (7.5) and the missing Future items (17).</w:t>
+              <w:t>Adds Referee Mode with its own controls and a referee rating (3.5, 3.5.1); body types with height and weight, fighting styles, an overall rating and an OVR 99 ceiling for every Career fighter (5.4.1 to 5.4.3). Fixes contradictions: multi-season Careers are part of 1.0, holding RB takes kicks but not punches to the head, punches register on the trunk protector, rivals switch style only between seasons, and the podium moment moves to the world series final. Gives every Career tournament tier its own venue (6.2). A second pass adds the knockdown count (8.5, 11.2), head values for side kicks (9.1), Referee Mode in the main menu (7.5) and the missing Future items (17); a third pass corrects a cross-reference in 1.8 and wording in 1.6 and 6.2.</w:t>
             </w:r>
           </w:p>
         </w:tc>

</xml_diff>

<commit_message>
Added belt bone chain, character pipeline tools, prototype screens and GDD updates; ignored generated model folders
</commit_message>
<xml_diff>
--- a/Docs/GDD_Open_Stance.docx
+++ b/Docs/GDD_Open_Stance.docx
@@ -221,7 +221,7 @@
                 <w:sz w:val="21"/>
                 <w:szCs w:val="21"/>
               </w:rPr>
-              <w:t>0.10 draft · updated 2026-10-04</w:t>
+              <w:t>0.11 draft · updated 2026-10-16</w:t>
             </w:r>
           </w:p>
         </w:tc>
@@ -8258,7 +8258,18 @@
         <w:t>[Future]</w:t>
       </w:r>
       <w:r>
-        <w:t xml:space="preserve"> tag marks the exceptions: expansion planned for after v1.0.</w:t>
+        <w:t xml:space="preserve"> tag marks the exceptions: expansion planned for after v1.0. Nothing tagged </w:t>
+      </w:r>
+      <w:r>
+        <w:rPr>
+          <w:b/>
+          <w:bCs/>
+          <w:color w:val="5A6470"/>
+        </w:rPr>
+        <w:t>[Future]</w:t>
+      </w:r>
+      <w:r>
+        <w:t xml:space="preserve"> is essential to the first v1.0 release. Those sections are documented so the design is complete and so there is a plan if the main features finish ahead of schedule; they are the first thing to leave out when time is short and they never block a milestone.</w:t>
       </w:r>
     </w:p>
     <w:p>
@@ -50406,7 +50417,7 @@
                 <w:sz w:val="20"/>
                 <w:szCs w:val="20"/>
               </w:rPr>
-              <w:t>Early feasibility test on a roundhouse kick and a spin hook kick, comparing capture methods and solvers before production (section 19). If spinning kicks are still not clean by Milestone 1, Milestone 2 ships them with placeholder animation and swaps in production mocap once the capture or solver issue is fixed (20.1).</w:t>
+              <w:t>Early feasibility test on a roundhouse kick and a spin hook kick, comparing capture methods and solvers before production (section 19). If spinning kicks are still not clean by Milestone 1, the December build (Milestone 2) is built on the grounded kicks and whatever the lab session captured cleanly. Any spinning or jump kick without clean capture ships with a temporary placeholder: the matching grounded technique with a boost in height. Production mocap replaces each placeholder as soon as the capture or solver issue is fixed (20.1).</w:t>
             </w:r>
           </w:p>
         </w:tc>
@@ -51735,7 +51746,7 @@
         <w:t>[Future]</w:t>
       </w:r>
       <w:r>
-        <w:t xml:space="preserve"> tag marks a deferred feature where it belongs in a system, so each system reads as a whole; this section summarizes them.</w:t>
+        <w:t xml:space="preserve"> tag marks a deferred feature where it belongs in a system, so each system reads as a whole; this section summarizes them. None of it is required for v1.0: it is design kept on file in case the main features are finished ahead of schedule.</w:t>
       </w:r>
     </w:p>
     <w:tbl>
@@ -54948,7 +54959,7 @@
                 <w:sz w:val="20"/>
                 <w:szCs w:val="20"/>
               </w:rPr>
-              <w:t>Two local players complete a basic sparring match, playable as a demo. If Milestone 1 cannot capture clean spinning kicks, this build ships them with placeholder animation rather than cutting them (16.4).</w:t>
+              <w:t>Two local players complete a basic sparring match, playable as a demo. If Milestone 1 cannot capture clean spinning kicks, this build is centred on the grounded kicks and whatever the lab session captured. Spinning and jump kicks stay in the move list with a temporary placeholder, the grounded technique with a boost in height, rather than being cut (16.4).</w:t>
             </w:r>
           </w:p>
         </w:tc>
@@ -55970,6 +55981,83 @@
                 <w:szCs w:val="20"/>
               </w:rPr>
               <w:t>Audio. Fighters kihap, grunt when hit and breathe harder below 25 stamina, with at least two men’s and two women’s voice sets; coaches shout short English cues from the corner chairs; each referee has their own voice; crowds never boo; and a quiet pulse marks a round’s last 10 seconds (1.10, 4.3, 8.9, 11.2). The referee names the side with a gam-jeom and calls the winner, with a time-out call for video review and injuries in Future (8.5, 11.2). Adds a fighter and coach voice volume (7.8), the Content/Audio folder and the SW_ and MS_ asset prefixes (16.5), and voice casting and the new referee calls to the open questions; the audio asset list is resolved and the art asset list stays open (1.2, 18.1, 18.2). Glossary: kihap, kye-shi and seung (22).</w:t>
+            </w:r>
+          </w:p>
+        </w:tc>
+      </w:tr>
+      <w:tr>
+        <w:trPr>
+          <w:cantSplit/>
+        </w:trPr>
+        <w:tc>
+          <w:tcPr>
+            <w:tcW w:w="1500" w:type="dxa"/>
+            <w:vAlign w:val="center"/>
+          </w:tcPr>
+          <w:p>
+            <w:pPr>
+              <w:spacing w:before="40" w:after="40"/>
+            </w:pPr>
+            <w:r>
+              <w:rPr>
+                <w:sz w:val="20"/>
+                <w:szCs w:val="20"/>
+              </w:rPr>
+              <w:t>2026-10-16</w:t>
+            </w:r>
+          </w:p>
+        </w:tc>
+        <w:tc>
+          <w:tcPr>
+            <w:tcW w:w="1000" w:type="dxa"/>
+            <w:vAlign w:val="center"/>
+          </w:tcPr>
+          <w:p>
+            <w:pPr>
+              <w:spacing w:before="40" w:after="40"/>
+            </w:pPr>
+            <w:r>
+              <w:rPr>
+                <w:sz w:val="20"/>
+                <w:szCs w:val="20"/>
+              </w:rPr>
+              <w:t>0.11</w:t>
+            </w:r>
+          </w:p>
+        </w:tc>
+        <w:tc>
+          <w:tcPr>
+            <w:tcW w:w="1700" w:type="dxa"/>
+            <w:vAlign w:val="center"/>
+          </w:tcPr>
+          <w:p>
+            <w:pPr>
+              <w:spacing w:before="40" w:after="40"/>
+            </w:pPr>
+            <w:r>
+              <w:rPr>
+                <w:sz w:val="20"/>
+                <w:szCs w:val="20"/>
+              </w:rPr>
+              <w:t>Joey Driedger</w:t>
+            </w:r>
+          </w:p>
+        </w:tc>
+        <w:tc>
+          <w:tcPr>
+            <w:tcW w:w="5160" w:type="dxa"/>
+            <w:vAlign w:val="center"/>
+          </w:tcPr>
+          <w:p>
+            <w:pPr>
+              <w:spacing w:before="40" w:after="40"/>
+            </w:pPr>
+            <w:r>
+              <w:rPr>
+                <w:sz w:val="20"/>
+                <w:szCs w:val="20"/>
+              </w:rPr>
+              <w:t>Feedback pass. Marks every [Future] section as non-essential to the first v1.0 release, documented in case the main features finish ahead of schedule (1, 17). Confirms PlayStation 5 and Xbox Series X|S as the v1.0 target, with Windows as the development and demo platform only (1.11, 16.4). Sharpens the December fallback if motion capture of spinning kicks fails: Milestone 2 centres on the grounded kicks and whatever the lab session captured, with the grounded technique plus a boost in height as the temporary placeholder for spinning and jump kicks (16.4, 20.1).</w:t>
             </w:r>
           </w:p>
         </w:tc>
@@ -57584,7 +57672,7 @@
         <w:color w:val="7F7F7F"/>
         <w:sz w:val="18"/>
       </w:rPr>
-      <w:t xml:space="preserve">Open Stance: Gyeorugi · Game Design Document · v0.10 draft · Page </w:t>
+      <w:t xml:space="preserve">Open Stance: Gyeorugi · Game Design Document · v0.11 draft · Page </w:t>
     </w:r>
     <w:r>
       <w:rPr>

</xml_diff>

<commit_message>
Recorded control, guard and roster decisions in the GDD (v0.12)
Kicks without RT use the lead leg, the spin hook requires RT, the left
stick moves the fighter, the Menu button pauses and L3 and R3 are unused.
Defined the four guard postures. The Men or Women choice now only picks
the premade roster. WT rules conflicts found in the 2026 check stay open
in 18.1. Corrected the README GDD version.
</commit_message>
<xml_diff>
--- a/Docs/GDD_Open_Stance.docx
+++ b/Docs/GDD_Open_Stance.docx
@@ -221,7 +221,7 @@
                 <w:sz w:val="21"/>
                 <w:szCs w:val="21"/>
               </w:rPr>
-              <w:t>0.11 draft · updated 2026-10-16</w:t>
+              <w:t>0.12 draft · updated 2026-10-30</w:t>
             </w:r>
           </w:p>
         </w:tc>
@@ -28280,7 +28280,7 @@
         <w:jc w:val="center"/>
       </w:pPr>
       <w:r>
-        <w:t>Inputs are written in Xbox button names; the PlayStation equivalents map one to one. The left stick is not assigned yet, so movement is assumed (18.1).</w:t>
+        <w:t>Inputs are written in Xbox button names; the PlayStation equivalents map one to one. The left stick moves the fighter (7.4).</w:t>
       </w:r>
     </w:p>
     <w:tbl>
@@ -30773,7 +30773,7 @@
         </w:drawing>
       </w:r>
       <w:r>
-        <w:t xml:space="preserve"> use the lead leg (to confirm, 18.1).</w:t>
+        <w:t xml:space="preserve"> use the lead leg.</w:t>
       </w:r>
     </w:p>
     <w:p>
@@ -31237,7 +31237,7 @@
                 <w:sz w:val="20"/>
                 <w:szCs w:val="20"/>
               </w:rPr>
-              <w:t>Sparring and Tournament use premade fighters only. The player picks the Men or Women roster, then a fighter for each side; the opponent comes from the same roster. The side (Chung or Hong) is assigned, never chosen. The created fighter is used in Career only.</w:t>
+              <w:t>Sparring and Tournament use premade fighters only. The player picks the Men or Women roster, then a fighter for each side; either roster can supply the opponent. The side (Chung or Hong) is assigned, never chosen. The created fighter is used in Career only.</w:t>
             </w:r>
           </w:p>
         </w:tc>
@@ -32849,7 +32849,7 @@
                 <w:sz w:val="20"/>
                 <w:szCs w:val="20"/>
               </w:rPr>
-              <w:t>Left stick (assumed, 18.1)</w:t>
+              <w:t>Left stick</w:t>
             </w:r>
           </w:p>
         </w:tc>
@@ -39657,7 +39657,107 @@
         <w:t>Guards</w:t>
       </w:r>
       <w:r>
-        <w:t xml:space="preserve"> differ in posture, readiness and transition timing, not stat bonuses. Each guard’s posture and strengths are not defined yet (18.1). All four guards ship in v1.0; their inputs are in 7.3.</w:t>
+        <w:t xml:space="preserve"> differ in posture, readiness and transition timing, not stat bonuses. All four guards ship in v1.0; their inputs are in 7.3, and each one is described below.</w:t>
+      </w:r>
+    </w:p>
+    <w:p>
+      <w:pPr>
+        <w:pStyle w:val="ListParagraph"/>
+        <w:numPr>
+          <w:ilvl w:val="0"/>
+          <w:numId w:val="1"/>
+        </w:numPr>
+        <w:spacing w:after="60"/>
+      </w:pPr>
+      <w:r>
+        <w:rPr>
+          <w:b/>
+          <w:bCs/>
+        </w:rPr>
+        <w:t>High Guard</w:t>
+      </w:r>
+      <w:r>
+        <w:t xml:space="preserve">: hands high and upright. The quickest guard to throw a head kick from and the slowest to start a body kick from.</w:t>
+      </w:r>
+    </w:p>
+    <w:p>
+      <w:pPr>
+        <w:pStyle w:val="ListParagraph"/>
+        <w:numPr>
+          <w:ilvl w:val="0"/>
+          <w:numId w:val="1"/>
+        </w:numPr>
+        <w:spacing w:after="60"/>
+      </w:pPr>
+      <w:r>
+        <w:rPr>
+          <w:b/>
+          <w:bCs/>
+        </w:rPr>
+        <w:t>Cross Guard</w:t>
+      </w:r>
+      <w:r>
+        <w:t xml:space="preserve">: rear hand forward across the body. A quick guard that covers body kicks on the open side.</w:t>
+      </w:r>
+    </w:p>
+    <w:p>
+      <w:pPr>
+        <w:pStyle w:val="ListParagraph"/>
+        <w:numPr>
+          <w:ilvl w:val="0"/>
+          <w:numId w:val="1"/>
+        </w:numPr>
+        <w:spacing w:after="60"/>
+      </w:pPr>
+      <w:r>
+        <w:rPr>
+          <w:b/>
+          <w:bCs/>
+        </w:rPr>
+        <w:t>Mixed Guard</w:t>
+      </w:r>
+      <w:r>
+        <w:t xml:space="preserve">: one hand high and one low. The balanced guard, the starting guard, and the quickest to change to any other guard.</w:t>
+      </w:r>
+    </w:p>
+    <w:p>
+      <w:pPr>
+        <w:pStyle w:val="ListParagraph"/>
+        <w:numPr>
+          <w:ilvl w:val="0"/>
+          <w:numId w:val="1"/>
+        </w:numPr>
+        <w:spacing w:after="60"/>
+      </w:pPr>
+      <w:r>
+        <w:rPr>
+          <w:b/>
+          <w:bCs/>
+        </w:rPr>
+        <w:t>Low Guard</w:t>
+      </w:r>
+      <w:r>
+        <w:t xml:space="preserve">: compact and lowered. The quickest guard to start a body kick from and the slowest to defend a head kick from. It is a normal guard and never counts as crouching (8.4).</w:t>
+      </w:r>
+    </w:p>
+    <w:p>
+      <w:pPr>
+        <w:pStyle w:val="ListParagraph"/>
+        <w:numPr>
+          <w:ilvl w:val="0"/>
+          <w:numId w:val="1"/>
+        </w:numPr>
+        <w:spacing w:after="60"/>
+      </w:pPr>
+      <w:r>
+        <w:rPr>
+          <w:b/>
+          <w:bCs/>
+        </w:rPr>
+        <w:t>Timing</w:t>
+      </w:r>
+      <w:r>
+        <w:t xml:space="preserve">: changing guard takes 0.15 to 0.25 s, with no stat bonus for any guard. These are starting values, tuned in playtests (18.1).</w:t>
       </w:r>
     </w:p>
     <w:p>
@@ -45862,7 +45962,7 @@
                 <w:sz w:val="20"/>
                 <w:szCs w:val="20"/>
               </w:rPr>
-              <w:t>Chooses the male or female MetaHuman body set; sets the fighter’s Men or Women category in competition (5.4.2)</w:t>
+              <w:t>Chooses the male or female MetaHuman body set; sets the roster the fighter appears in; it has no effect on rules, scoring or ratings (5.4.2)</w:t>
             </w:r>
           </w:p>
         </w:tc>
@@ -52153,7 +52253,7 @@
         <w:spacing w:after="60"/>
       </w:pPr>
       <w:r>
-        <w:t>Whether kicks without RT always use the lead leg.</w:t>
+        <w:t>Inputs for the techniques in 9.4, or whether they are cut.</w:t>
       </w:r>
     </w:p>
     <w:p>
@@ -52166,7 +52266,20 @@
         <w:spacing w:after="60"/>
       </w:pPr>
       <w:r>
-        <w:t>The spin hook kick lists RT: whether RT is required for it or only selects the back leg.</w:t>
+        <w:t>Playtest the Skill Stick gestures and the 0.25 s gesture window.</w:t>
+      </w:r>
+    </w:p>
+    <w:p>
+      <w:pPr>
+        <w:keepNext/>
+        <w:spacing w:before="120" w:after="60"/>
+      </w:pPr>
+      <w:r>
+        <w:rPr>
+          <w:b/>
+          <w:bCs/>
+        </w:rPr>
+        <w:t>Rules and tuning</w:t>
       </w:r>
     </w:p>
     <w:p>
@@ -52179,7 +52292,7 @@
         <w:spacing w:after="60"/>
       </w:pPr>
       <w:r>
-        <w:t>The posture and strengths of the High, Cross, Mixed and Low guards.</w:t>
+        <w:t>Current WT tie-break order and per-round penalty limit. The WT Competition Rules and Interpretation in force from 1 June 2026 have not been read in full; sources disagree on the limit (4 gam-jeom in the 2022 interpretation, 5 here).</w:t>
       </w:r>
     </w:p>
     <w:p>
@@ -52192,72 +52305,7 @@
         <w:spacing w:after="60"/>
       </w:pPr>
       <w:r>
-        <w:t>Inputs for movement (left stick assumed), pause and menus, and whether L3 and R3 are used.</w:t>
-      </w:r>
-    </w:p>
-    <w:p>
-      <w:pPr>
-        <w:pStyle w:val="ListParagraph"/>
-        <w:numPr>
-          <w:ilvl w:val="0"/>
-          <w:numId w:val="1"/>
-        </w:numPr>
-        <w:spacing w:after="60"/>
-      </w:pPr>
-      <w:r>
-        <w:t>Inputs for the techniques in 9.4, or whether they are cut.</w:t>
-      </w:r>
-    </w:p>
-    <w:p>
-      <w:pPr>
-        <w:pStyle w:val="ListParagraph"/>
-        <w:numPr>
-          <w:ilvl w:val="0"/>
-          <w:numId w:val="1"/>
-        </w:numPr>
-        <w:spacing w:after="60"/>
-      </w:pPr>
-      <w:r>
-        <w:t>Playtest the Skill Stick gestures and the 0.25 s gesture window.</w:t>
-      </w:r>
-    </w:p>
-    <w:p>
-      <w:pPr>
-        <w:keepNext/>
-        <w:spacing w:before="120" w:after="60"/>
-      </w:pPr>
-      <w:r>
-        <w:rPr>
-          <w:b/>
-          <w:bCs/>
-        </w:rPr>
-        <w:t>Rules and tuning</w:t>
-      </w:r>
-    </w:p>
-    <w:p>
-      <w:pPr>
-        <w:pStyle w:val="ListParagraph"/>
-        <w:numPr>
-          <w:ilvl w:val="0"/>
-          <w:numId w:val="1"/>
-        </w:numPr>
-        <w:spacing w:after="60"/>
-      </w:pPr>
-      <w:r>
-        <w:t>Current WT tie-break order and per-round penalty limit.</w:t>
-      </w:r>
-    </w:p>
-    <w:p>
-      <w:pPr>
-        <w:pStyle w:val="ListParagraph"/>
-        <w:numPr>
-          <w:ilvl w:val="0"/>
-          <w:numId w:val="1"/>
-        </w:numPr>
-        <w:spacing w:after="60"/>
-      </w:pPr>
-      <w:r>
-        <w:t>Verify WT values: start-mark spacing, the 3-second leg-lift limit, passivity timer length, the trunk protector impact threshold, and the referee’s side, winner and time-out calls (8.5).</w:t>
+        <w:t>Verify WT values: start-mark spacing, the 3-second leg-lift limit, passivity timer length, the trunk protector impact threshold, and the referee’s side, winner and time-out calls (8.5). Also check the passivity penalty in the last 10 seconds of a round (sources give both 2 points to the opponent and 3 gam-jeom) and the boundary foul (any part of the foot over the line in the 2026 rules, against both feet here, 8.4).</w:t>
       </w:r>
     </w:p>
     <w:p>
@@ -53579,7 +53627,7 @@
                 <w:sz w:val="20"/>
                 <w:szCs w:val="20"/>
               </w:rPr>
-              <w:t>Cut for playability: one open division, no gender split. Body types keep a height and weight, which set reach, build and Career base ratings only (5.4.2)</w:t>
+              <w:t>Cut for playability: one open division, no gender-based rules or division. The Men or Women choice only picks the premade roster and body set, and either roster can face the other. Body types keep a height and weight, which set reach, build and Career base ratings only (5.4.2, 7.5)</w:t>
             </w:r>
           </w:p>
         </w:tc>
@@ -53597,7 +53645,243 @@
                 <w:sz w:val="20"/>
                 <w:szCs w:val="20"/>
               </w:rPr>
-              <w:t>5.4.2, 10.1</w:t>
+              <w:t>5.4.2, 7.5, 10.1</w:t>
+            </w:r>
+          </w:p>
+        </w:tc>
+      </w:tr>
+      <w:tr>
+        <w:trPr>
+          <w:cantSplit/>
+        </w:trPr>
+        <w:tc>
+          <w:tcPr>
+            <w:tcW w:w="2400" w:type="dxa"/>
+            <w:vAlign w:val="center"/>
+          </w:tcPr>
+          <w:p>
+            <w:pPr>
+              <w:spacing w:before="40" w:after="40"/>
+            </w:pPr>
+            <w:r>
+              <w:rPr>
+                <w:sz w:val="20"/>
+                <w:szCs w:val="20"/>
+              </w:rPr>
+              <w:t>Kicks without RT</w:t>
+            </w:r>
+          </w:p>
+        </w:tc>
+        <w:tc>
+          <w:tcPr>
+            <w:tcW w:w="5460" w:type="dxa"/>
+            <w:vAlign w:val="center"/>
+          </w:tcPr>
+          <w:p>
+            <w:pPr>
+              <w:spacing w:before="40" w:after="40"/>
+            </w:pPr>
+            <w:r>
+              <w:rPr>
+                <w:sz w:val="20"/>
+                <w:szCs w:val="20"/>
+              </w:rPr>
+              <w:t>Use the lead leg; RT selects the back leg</w:t>
+            </w:r>
+          </w:p>
+        </w:tc>
+        <w:tc>
+          <w:tcPr>
+            <w:tcW w:w="1500" w:type="dxa"/>
+            <w:vAlign w:val="center"/>
+          </w:tcPr>
+          <w:p>
+            <w:pPr>
+              <w:spacing w:before="40" w:after="40"/>
+            </w:pPr>
+            <w:r>
+              <w:rPr>
+                <w:sz w:val="20"/>
+                <w:szCs w:val="20"/>
+              </w:rPr>
+              <w:t>7.4, 8.6</w:t>
+            </w:r>
+          </w:p>
+        </w:tc>
+      </w:tr>
+      <w:tr>
+        <w:trPr>
+          <w:cantSplit/>
+        </w:trPr>
+        <w:tc>
+          <w:tcPr>
+            <w:tcW w:w="2400" w:type="dxa"/>
+            <w:vAlign w:val="center"/>
+          </w:tcPr>
+          <w:p>
+            <w:pPr>
+              <w:spacing w:before="40" w:after="40"/>
+            </w:pPr>
+            <w:r>
+              <w:rPr>
+                <w:sz w:val="20"/>
+                <w:szCs w:val="20"/>
+              </w:rPr>
+              <w:t>Spin hook kick and RT</w:t>
+            </w:r>
+          </w:p>
+        </w:tc>
+        <w:tc>
+          <w:tcPr>
+            <w:tcW w:w="5460" w:type="dxa"/>
+            <w:vAlign w:val="center"/>
+          </w:tcPr>
+          <w:p>
+            <w:pPr>
+              <w:spacing w:before="40" w:after="40"/>
+            </w:pPr>
+            <w:r>
+              <w:rPr>
+                <w:sz w:val="20"/>
+                <w:szCs w:val="20"/>
+              </w:rPr>
+              <w:t>RT is required: the spin hook is thrown by the back leg, so its gesture is mirrored like any back-leg kick</w:t>
+            </w:r>
+          </w:p>
+        </w:tc>
+        <w:tc>
+          <w:tcPr>
+            <w:tcW w:w="1500" w:type="dxa"/>
+            <w:vAlign w:val="center"/>
+          </w:tcPr>
+          <w:p>
+            <w:pPr>
+              <w:spacing w:before="40" w:after="40"/>
+            </w:pPr>
+            <w:r>
+              <w:rPr>
+                <w:sz w:val="20"/>
+                <w:szCs w:val="20"/>
+              </w:rPr>
+              <w:t>7.2, 9.2</w:t>
+            </w:r>
+          </w:p>
+        </w:tc>
+      </w:tr>
+      <w:tr>
+        <w:trPr>
+          <w:cantSplit/>
+        </w:trPr>
+        <w:tc>
+          <w:tcPr>
+            <w:tcW w:w="2400" w:type="dxa"/>
+            <w:vAlign w:val="center"/>
+          </w:tcPr>
+          <w:p>
+            <w:pPr>
+              <w:spacing w:before="40" w:after="40"/>
+            </w:pPr>
+            <w:r>
+              <w:rPr>
+                <w:sz w:val="20"/>
+                <w:szCs w:val="20"/>
+              </w:rPr>
+              <w:t>Guard postures</w:t>
+            </w:r>
+          </w:p>
+        </w:tc>
+        <w:tc>
+          <w:tcPr>
+            <w:tcW w:w="5460" w:type="dxa"/>
+            <w:vAlign w:val="center"/>
+          </w:tcPr>
+          <w:p>
+            <w:pPr>
+              <w:spacing w:before="40" w:after="40"/>
+            </w:pPr>
+            <w:r>
+              <w:rPr>
+                <w:sz w:val="20"/>
+                <w:szCs w:val="20"/>
+              </w:rPr>
+              <w:t>High, Cross, Mixed and Low differ in posture, readiness and transition timing with no stat bonuses; Mixed is the starting guard and Low is never crouching</w:t>
+            </w:r>
+          </w:p>
+        </w:tc>
+        <w:tc>
+          <w:tcPr>
+            <w:tcW w:w="1500" w:type="dxa"/>
+            <w:vAlign w:val="center"/>
+          </w:tcPr>
+          <w:p>
+            <w:pPr>
+              <w:spacing w:before="40" w:after="40"/>
+            </w:pPr>
+            <w:r>
+              <w:rPr>
+                <w:sz w:val="20"/>
+                <w:szCs w:val="20"/>
+              </w:rPr>
+              <w:t>8.7, 8.4</w:t>
+            </w:r>
+          </w:p>
+        </w:tc>
+      </w:tr>
+      <w:tr>
+        <w:trPr>
+          <w:cantSplit/>
+        </w:trPr>
+        <w:tc>
+          <w:tcPr>
+            <w:tcW w:w="2400" w:type="dxa"/>
+            <w:vAlign w:val="center"/>
+          </w:tcPr>
+          <w:p>
+            <w:pPr>
+              <w:spacing w:before="40" w:after="40"/>
+            </w:pPr>
+            <w:r>
+              <w:rPr>
+                <w:sz w:val="20"/>
+                <w:szCs w:val="20"/>
+              </w:rPr>
+              <w:t>Movement, pause, L3 and R3</w:t>
+            </w:r>
+          </w:p>
+        </w:tc>
+        <w:tc>
+          <w:tcPr>
+            <w:tcW w:w="5460" w:type="dxa"/>
+            <w:vAlign w:val="center"/>
+          </w:tcPr>
+          <w:p>
+            <w:pPr>
+              <w:spacing w:before="40" w:after="40"/>
+            </w:pPr>
+            <w:r>
+              <w:rPr>
+                <w:sz w:val="20"/>
+                <w:szCs w:val="20"/>
+              </w:rPr>
+              <w:t>The left stick moves the fighter, the Menu button pauses, and L3 and R3 are unused in v1.0</w:t>
+            </w:r>
+          </w:p>
+        </w:tc>
+        <w:tc>
+          <w:tcPr>
+            <w:tcW w:w="1500" w:type="dxa"/>
+            <w:vAlign w:val="center"/>
+          </w:tcPr>
+          <w:p>
+            <w:pPr>
+              <w:spacing w:before="40" w:after="40"/>
+            </w:pPr>
+            <w:r>
+              <w:rPr>
+                <w:sz w:val="20"/>
+                <w:szCs w:val="20"/>
+              </w:rPr>
+              <w:t>7.4, 7.10</w:t>
             </w:r>
           </w:p>
         </w:tc>
@@ -56058,6 +56342,83 @@
                 <w:szCs w:val="20"/>
               </w:rPr>
               <w:t>Feedback pass. Marks every [Future] section as non-essential to the first v1.0 release, documented in case the main features finish ahead of schedule (1, 17). Confirms PlayStation 5 and Xbox Series X|S as the v1.0 target, with Windows as the development and demo platform only (1.11, 16.4). Sharpens the December fallback if motion capture of spinning kicks fails: Milestone 2 centres on the grounded kicks and whatever the lab session captured, with the grounded technique plus a boost in height as the temporary placeholder for spinning and jump kicks (16.4, 20.1).</w:t>
+            </w:r>
+          </w:p>
+        </w:tc>
+      </w:tr>
+      <w:tr>
+        <w:trPr>
+          <w:cantSplit/>
+        </w:trPr>
+        <w:tc>
+          <w:tcPr>
+            <w:tcW w:w="1500" w:type="dxa"/>
+            <w:vAlign w:val="center"/>
+          </w:tcPr>
+          <w:p>
+            <w:pPr>
+              <w:spacing w:before="40" w:after="40"/>
+            </w:pPr>
+            <w:r>
+              <w:rPr>
+                <w:sz w:val="20"/>
+                <w:szCs w:val="20"/>
+              </w:rPr>
+              <w:t>2026-10-30</w:t>
+            </w:r>
+          </w:p>
+        </w:tc>
+        <w:tc>
+          <w:tcPr>
+            <w:tcW w:w="1000" w:type="dxa"/>
+            <w:vAlign w:val="center"/>
+          </w:tcPr>
+          <w:p>
+            <w:pPr>
+              <w:spacing w:before="40" w:after="40"/>
+            </w:pPr>
+            <w:r>
+              <w:rPr>
+                <w:sz w:val="20"/>
+                <w:szCs w:val="20"/>
+              </w:rPr>
+              <w:t>0.12</w:t>
+            </w:r>
+          </w:p>
+        </w:tc>
+        <w:tc>
+          <w:tcPr>
+            <w:tcW w:w="1700" w:type="dxa"/>
+            <w:vAlign w:val="center"/>
+          </w:tcPr>
+          <w:p>
+            <w:pPr>
+              <w:spacing w:before="40" w:after="40"/>
+            </w:pPr>
+            <w:r>
+              <w:rPr>
+                <w:sz w:val="20"/>
+                <w:szCs w:val="20"/>
+              </w:rPr>
+              <w:t>Joey Driedger</w:t>
+            </w:r>
+          </w:p>
+        </w:tc>
+        <w:tc>
+          <w:tcPr>
+            <w:tcW w:w="5160" w:type="dxa"/>
+            <w:vAlign w:val="center"/>
+          </w:tcPr>
+          <w:p>
+            <w:pPr>
+              <w:spacing w:before="40" w:after="40"/>
+            </w:pPr>
+            <w:r>
+              <w:rPr>
+                <w:sz w:val="20"/>
+                <w:szCs w:val="20"/>
+              </w:rPr>
+              <w:t>Control and scope decisions. Kicks without RT use the lead leg, the spin hook requires RT, the left stick moves the fighter, the Menu button pauses and L3 and R3 are unused (7.4, 7.10). Defines the four guard postures (8.7). The Men or Women choice picks the roster only, and either roster can face the other (7.5, 10.1). Records the open conflicts found checking the 2026 WT rules (18.1).</w:t>
             </w:r>
           </w:p>
         </w:tc>
@@ -57672,7 +58033,7 @@
         <w:color w:val="7F7F7F"/>
         <w:sz w:val="18"/>
       </w:rPr>
-      <w:t xml:space="preserve">Open Stance: Gyeorugi · Game Design Document · v0.11 draft · Page </w:t>
+      <w:t xml:space="preserve">Open Stance: Gyeorugi · Game Design Document · v0.12 draft · Page </w:t>
     </w:r>
     <w:r>
       <w:rPr>

</xml_diff>

<commit_message>
Checked the GDD against the WT competition rules
Set the tie-break order and start marks from the January 2026 edition,
corrected the boundary penalty to a foot crossing the line and cited
the gam-jeom and leg-lift limits. The June 2026 amendments (15-point
gap, two-point passivity penalty in the last 10 seconds) are recorded
in 18.1 as an open decision.
</commit_message>
<xml_diff>
--- a/Docs/GDD_Open_Stance.docx
+++ b/Docs/GDD_Open_Stance.docx
@@ -26869,7 +26869,7 @@
                 <w:sz w:val="20"/>
                 <w:szCs w:val="20"/>
               </w:rPr>
-              <w:t>Chung and Hong marks on the centre line, facing each other. Spacing follows the current WT rules (18.1).</w:t>
+              <w:t>Chung and Hong marks on the centre line, facing each other, 1 m either side of the centre point (WT Article 3, clause 2.3).</w:t>
             </w:r>
           </w:p>
         </w:tc>
@@ -38554,7 +38554,7 @@
           <w:sz w:val="20"/>
           <w:szCs w:val="20"/>
         </w:rPr>
-        <w:t>Tie-breaks follow WT order (higher-value techniques first, then referee decision). Verify the current tie-break order and per-round penalty limit.</w:t>
+        <w:t>Tie-breaks follow WT Article 15 (in force 1 January 2026). A round tied on points goes to the fighter with more points from turning or spinning kicks, then more points in the order head, trunk, punch, gam-jeom, then more electronic protector hits, then the referee’s decision.</w:t>
       </w:r>
     </w:p>
     <w:p>
@@ -38572,7 +38572,7 @@
         <w:spacing w:after="60"/>
       </w:pPr>
       <w:r>
-        <w:t>A gam-jeom gives the opponent one point, and a fighter who reaches 5 gam-jeom in a round loses it (starting value; verify the current WT per-round limit, 18.1). Penalties the game detects, and exactly what triggers each one:</w:t>
+        <w:t>A gam-jeom gives the opponent one point, and a fighter who reaches 5 gam-jeom in a round loses it (WT Article 14, clause 7.1, best of three). Penalties the game detects, and exactly what triggers each one:</w:t>
       </w:r>
     </w:p>
     <w:p>
@@ -38585,7 +38585,7 @@
         <w:spacing w:after="60"/>
       </w:pPr>
       <w:r>
-        <w:t>Boundary: both of the fighter’s feet are completely outside the mat’s edge (6.3) at the same instant. One foot outside, or a foot only touching the line, does not trigger it.</w:t>
+        <w:t>Boundary: a foot crosses the mat’s edge (6.3), unless an opponent’s prohibited act forced the fighter over it (WT Article 14, Explanation 1). A foot only touching the line does not trigger it.</w:t>
       </w:r>
     </w:p>
     <w:p>
@@ -38615,7 +38615,7 @@
       </w:r>
       <w:r>
         <w:lastRenderedPageBreak/>
-        <w:t>guard choice); or neither fighter’s technique reaches its active phase for 6 s straight, the passivity timer (not engaging) — starting values; verify against current WT rules (18.1).</w:t>
+        <w:t>guard choice); or neither fighter’s technique reaches its active phase for 6 s straight, the passivity timer (not engaging) — starting values. The 6 s timer follows WT Article 14, Explanation 1: after 3 s with no activity the referee calls GONG-GYEOK, and 3 s later a gam-jeom goes to both fighters, or to the one who moved back (18.1).</w:t>
       </w:r>
     </w:p>
     <w:p>
@@ -38628,7 +38628,7 @@
         <w:spacing w:after="60"/>
       </w:pPr>
       <w:r>
-        <w:t>Leg lifting: the lead or back leg held above hip height for more than 3 continuous seconds while outside that leg’s own technique (Attack Active or Attack Recovery, 16.3).</w:t>
+        <w:t>Leg lifting: the lead or back leg held above hip height for more than 3 continuous seconds while outside that leg’s own technique (Attack Active or Attack Recovery, 16.3); the 3 s limit is WT Article 14, clause 4.1.5.</w:t>
       </w:r>
     </w:p>
     <w:p>
@@ -52292,7 +52292,7 @@
         <w:spacing w:after="60"/>
       </w:pPr>
       <w:r>
-        <w:t>Current WT tie-break order and per-round penalty limit. The WT Competition Rules and Interpretation in force from 1 June 2026 have not been read in full; sources disagree on the limit (4 gam-jeom in the 2022 interpretation, 5 here).</w:t>
+        <w:t>Decide whether to follow the WT amendments effective 1 June 2026 (best of three), as published by the Dutch federation; the consolidated June 2026 text has not been read. The point gap per round rises from 12 to 15 points (Article 16), a passivity gam-jeom in the last 10 seconds of a round is worth 2 points to the opponent (Articles 12 and 14), and the final bow comes before the winner is declared (Article 10). Following the gap change also renames the Twelve Points to Your House trophy (5.7).</w:t>
       </w:r>
     </w:p>
     <w:p>
@@ -52305,7 +52305,7 @@
         <w:spacing w:after="60"/>
       </w:pPr>
       <w:r>
-        <w:t>Verify WT values: start-mark spacing, the 3-second leg-lift limit, passivity timer length, the trunk protector impact threshold, and the referee’s side, winner and time-out calls (8.5). Also check the passivity penalty in the last 10 seconds of a round (sources give both 2 points to the opponent and 3 gam-jeom) and the boundary foul (any part of the foot over the line in the 2026 rules, against both feet here, 8.4).</w:t>
+        <w:t>Choose the trunk protector impact threshold: WT leaves it to its Technical Committee, sets it per weight category, gender and age, and publishes no number (8.3). Add the GONG-GYEOK command to 8.5, and decide whether the 10-gam-jeom match loss and the four-air-kicks leg-lift penalty (WT Article 14) apply.</w:t>
       </w:r>
     </w:p>
     <w:p>
@@ -53882,6 +53882,65 @@
                 <w:szCs w:val="20"/>
               </w:rPr>
               <w:t>7.4, 7.10</w:t>
+            </w:r>
+          </w:p>
+        </w:tc>
+      </w:tr>
+      <w:tr>
+        <w:trPr>
+          <w:cantSplit/>
+        </w:trPr>
+        <w:tc>
+          <w:tcPr>
+            <w:tcW w:w="2400" w:type="dxa"/>
+            <w:vAlign w:val="center"/>
+          </w:tcPr>
+          <w:p>
+            <w:pPr>
+              <w:spacing w:before="40" w:after="40"/>
+            </w:pPr>
+            <w:r>
+              <w:rPr>
+                <w:sz w:val="20"/>
+                <w:szCs w:val="20"/>
+              </w:rPr>
+              <w:t>WT rules check (January 2026 edition)</w:t>
+            </w:r>
+          </w:p>
+        </w:tc>
+        <w:tc>
+          <w:tcPr>
+            <w:tcW w:w="5460" w:type="dxa"/>
+            <w:vAlign w:val="center"/>
+          </w:tcPr>
+          <w:p>
+            <w:pPr>
+              <w:spacing w:before="40" w:after="40"/>
+            </w:pPr>
+            <w:r>
+              <w:rPr>
+                <w:sz w:val="20"/>
+                <w:szCs w:val="20"/>
+              </w:rPr>
+              <w:t>Round length, point values, the 5-gam-jeom round limit, the 3-second leg lift, the tie-break order and the start marks match the WT Competition Rules and Interpretation in force 1 January 2026. A foot crossing the boundary is a gam-jeom, not both feet. The June 2026 amendments stay open (18.1)</w:t>
+            </w:r>
+          </w:p>
+        </w:tc>
+        <w:tc>
+          <w:tcPr>
+            <w:tcW w:w="1500" w:type="dxa"/>
+            <w:vAlign w:val="center"/>
+          </w:tcPr>
+          <w:p>
+            <w:pPr>
+              <w:spacing w:before="40" w:after="40"/>
+            </w:pPr>
+            <w:r>
+              <w:rPr>
+                <w:sz w:val="20"/>
+                <w:szCs w:val="20"/>
+              </w:rPr>
+              <w:t>8.3, 8.4, 6.3</w:t>
             </w:r>
           </w:p>
         </w:tc>
@@ -56418,7 +56477,7 @@
                 <w:sz w:val="20"/>
                 <w:szCs w:val="20"/>
               </w:rPr>
-              <w:t>Control and scope decisions. Kicks without RT use the lead leg, the spin hook requires RT, the left stick moves the fighter, the Menu button pauses and L3 and R3 are unused (7.4, 7.10). Defines the four guard postures (8.7). The Men or Women choice picks the roster only, and either roster can face the other (7.5, 10.1). Records the open conflicts found checking the 2026 WT rules (18.1).</w:t>
+              <w:t>Control and scope decisions. Kicks without RT use the lead leg, the spin hook requires RT, the left stick moves the fighter, the Menu button pauses and L3 and R3 are unused (7.4, 7.10). Defines the four guard postures (8.7). The Men or Women choice picks the roster only, and either roster can face the other (7.5, 10.1). Checks the WT rules against the January 2026 edition and the June 2026 amendments: the boundary penalty is a foot crossing the line, the tie-break order and start marks are set, and the June changes are an open decision (8.3, 8.4, 18.1).</w:t>
             </w:r>
           </w:p>
         </w:tc>

</xml_diff>

<commit_message>
Kept the 12-point gap in the GDD
The game stays at 12 points per round and the Twelve Points to Your House
trophy keeps its name. The remaining June 2026 amendments stay open in 18.1.
</commit_message>
<xml_diff>
--- a/Docs/GDD_Open_Stance.docx
+++ b/Docs/GDD_Open_Stance.docx
@@ -52292,7 +52292,7 @@
         <w:spacing w:after="60"/>
       </w:pPr>
       <w:r>
-        <w:t>Decide whether to follow the WT amendments effective 1 June 2026 (best of three), as published by the Dutch federation; the consolidated June 2026 text has not been read. The point gap per round rises from 12 to 15 points (Article 16), a passivity gam-jeom in the last 10 seconds of a round is worth 2 points to the opponent (Articles 12 and 14), and the final bow comes before the winner is declared (Article 10). Following the gap change also renames the Twelve Points to Your House trophy (5.7).</w:t>
+        <w:t>Decide whether to follow the other WT amendments effective 1 June 2026 (best of three), as published by the Dutch federation; the consolidated June 2026 text has not been read. A passivity gam-jeom in the last 10 seconds of a round is worth 2 points to the opponent (Articles 12 and 14), and the final bow comes before the winner is declared (Article 10).</w:t>
       </w:r>
     </w:p>
     <w:p>
@@ -53941,6 +53941,65 @@
                 <w:szCs w:val="20"/>
               </w:rPr>
               <w:t>8.3, 8.4, 6.3</w:t>
+            </w:r>
+          </w:p>
+        </w:tc>
+      </w:tr>
+      <w:tr>
+        <w:trPr>
+          <w:cantSplit/>
+        </w:trPr>
+        <w:tc>
+          <w:tcPr>
+            <w:tcW w:w="2400" w:type="dxa"/>
+            <w:vAlign w:val="center"/>
+          </w:tcPr>
+          <w:p>
+            <w:pPr>
+              <w:spacing w:before="40" w:after="40"/>
+            </w:pPr>
+            <w:r>
+              <w:rPr>
+                <w:sz w:val="20"/>
+                <w:szCs w:val="20"/>
+              </w:rPr>
+              <w:t>Point gap</w:t>
+            </w:r>
+          </w:p>
+        </w:tc>
+        <w:tc>
+          <w:tcPr>
+            <w:tcW w:w="5460" w:type="dxa"/>
+            <w:vAlign w:val="center"/>
+          </w:tcPr>
+          <w:p>
+            <w:pPr>
+              <w:spacing w:before="40" w:after="40"/>
+            </w:pPr>
+            <w:r>
+              <w:rPr>
+                <w:sz w:val="20"/>
+                <w:szCs w:val="20"/>
+              </w:rPr>
+              <w:t>Stays at 12 points per round, as in the WT rules in force 1 January 2026. WT raises it to 15 from 1 June 2026 (best of three); the game keeps 12 by choice, so the Twelve Points to Your House trophy keeps its name</w:t>
+            </w:r>
+          </w:p>
+        </w:tc>
+        <w:tc>
+          <w:tcPr>
+            <w:tcW w:w="1500" w:type="dxa"/>
+            <w:vAlign w:val="center"/>
+          </w:tcPr>
+          <w:p>
+            <w:pPr>
+              <w:spacing w:before="40" w:after="40"/>
+            </w:pPr>
+            <w:r>
+              <w:rPr>
+                <w:sz w:val="20"/>
+                <w:szCs w:val="20"/>
+              </w:rPr>
+              <w:t>8.2, 5.7</w:t>
             </w:r>
           </w:p>
         </w:tc>

</xml_diff>

<commit_message>
Set the protector impact threshold and wrote out the December capture fallback
Addresses the instructor feedback: the trunk impact threshold is 30 on the
0 to 100 MoveData impact scale, and section 19 now states the December
fallback in one sentence.
</commit_message>
<xml_diff>
--- a/Docs/GDD_Open_Stance.docx
+++ b/Docs/GDD_Open_Stance.docx
@@ -38104,7 +38104,7 @@
     </w:p>
     <w:p>
       <w:r>
-        <w:t>Hits register the way the electronic protector and scoring system (PSS) does: the trunk protector needs a valid kick above an impact threshold or a valid punch, and the head needs valid kick contact. In game, a hit registers when the attacking limb’s trace reaches the target zone during the active phase with enough impact.</w:t>
+        <w:t>Hits register the way the electronic protector and scoring system (PSS) does: the trunk protector needs a valid kick above an impact threshold or a valid punch, and the head needs valid kick contact. In game, a hit registers when the attacking limb’s trace reaches the target zone during the active phase with enough impact. The trunk impact threshold is 30 on the 0 to 100 impact scale of the MoveData table (16.3): a full-strength kick has an impact of 55 to 80, and low stamina cuts it by 20%, so only glancing contact falls below the threshold. It is a starting value, tuned in playtests.</w:t>
       </w:r>
     </w:p>
     <w:tbl>
@@ -47867,7 +47867,7 @@
                 <w:sz w:val="20"/>
                 <w:szCs w:val="20"/>
               </w:rPr>
-              <w:t>Side colour Chung or Hong; impact threshold (value unresolved, 18.1)</w:t>
+              <w:t>Side colour Chung or Hong; impact threshold 30 (8.3)</w:t>
             </w:r>
           </w:p>
         </w:tc>
@@ -52305,7 +52305,7 @@
         <w:spacing w:after="60"/>
       </w:pPr>
       <w:r>
-        <w:t>Choose the trunk protector impact threshold: WT leaves it to its Technical Committee, sets it per weight category, gender and age, and publishes no number (8.3). Add the GONG-GYEOK command to 8.5, and decide whether the 10-gam-jeom match loss and the four-air-kicks leg-lift penalty (WT Article 14) apply.</w:t>
+        <w:t>Add the GONG-GYEOK command to 8.5, and decide whether the 10-gam-jeom match loss and the four-air-kicks leg-lift penalty (WT Article 14) apply.</w:t>
       </w:r>
     </w:p>
     <w:p>
@@ -53963,6 +53963,65 @@
                 <w:sz w:val="20"/>
                 <w:szCs w:val="20"/>
               </w:rPr>
+              <w:t>Protector impact threshold</w:t>
+            </w:r>
+          </w:p>
+        </w:tc>
+        <w:tc>
+          <w:tcPr>
+            <w:tcW w:w="5460" w:type="dxa"/>
+            <w:vAlign w:val="center"/>
+          </w:tcPr>
+          <w:p>
+            <w:pPr>
+              <w:spacing w:before="40" w:after="40"/>
+            </w:pPr>
+            <w:r>
+              <w:rPr>
+                <w:sz w:val="20"/>
+                <w:szCs w:val="20"/>
+              </w:rPr>
+              <w:t>Set at 30 on the 0 to 100 impact scale of MoveData; a starting value, tuned in playtests</w:t>
+            </w:r>
+          </w:p>
+        </w:tc>
+        <w:tc>
+          <w:tcPr>
+            <w:tcW w:w="1500" w:type="dxa"/>
+            <w:vAlign w:val="center"/>
+          </w:tcPr>
+          <w:p>
+            <w:pPr>
+              <w:spacing w:before="40" w:after="40"/>
+            </w:pPr>
+            <w:r>
+              <w:rPr>
+                <w:sz w:val="20"/>
+                <w:szCs w:val="20"/>
+              </w:rPr>
+              <w:t>8.3, 16.3</w:t>
+            </w:r>
+          </w:p>
+        </w:tc>
+      </w:tr>
+      <w:tr>
+        <w:trPr>
+          <w:cantSplit/>
+        </w:trPr>
+        <w:tc>
+          <w:tcPr>
+            <w:tcW w:w="2400" w:type="dxa"/>
+            <w:vAlign w:val="center"/>
+          </w:tcPr>
+          <w:p>
+            <w:pPr>
+              <w:spacing w:before="40" w:after="40"/>
+            </w:pPr>
+            <w:r>
+              <w:rPr>
+                <w:sz w:val="20"/>
+                <w:szCs w:val="20"/>
+              </w:rPr>
               <w:t>Point gap</w:t>
             </w:r>
           </w:p>
@@ -54145,6 +54204,18 @@
     <w:p>
       <w:r>
         <w:t>No prototypes exist yet. Each one links here when built.</w:t>
+      </w:r>
+    </w:p>
+    <w:p>
+      <w:r>
+        <w:rPr>
+          <w:b/>
+          <w:bCs/>
+        </w:rPr>
+        <w:t>December fallback:</w:t>
+      </w:r>
+      <w:r>
+        <w:t xml:space="preserve"> if the November capture of spinning kicks comes back messy, the December demo uses the grounded kicks that captured cleanly, and each spinning or jump kick uses the matching grounded kick raised in height as a placeholder until a clean capture replaces it (16.4, 20.1).</w:t>
       </w:r>
     </w:p>
     <w:tbl>
@@ -56536,7 +56607,7 @@
                 <w:sz w:val="20"/>
                 <w:szCs w:val="20"/>
               </w:rPr>
-              <w:t>Control and scope decisions. Kicks without RT use the lead leg, the spin hook requires RT, the left stick moves the fighter, the Menu button pauses and L3 and R3 are unused (7.4, 7.10). Defines the four guard postures (8.7). The Men or Women choice picks the roster only, and either roster can face the other (7.5, 10.1). Checks the WT rules against the January 2026 edition and the June 2026 amendments: the boundary penalty is a foot crossing the line, the tie-break order and start marks are set, and the June changes are an open decision (8.3, 8.4, 18.1).</w:t>
+              <w:t>Control and scope decisions. Kicks without RT use the lead leg, the spin hook requires RT, the left stick moves the fighter, the Menu button pauses and L3 and R3 are unused (7.4, 7.10). Defines the four guard postures (8.7). The Men or Women choice picks the roster only, and either roster can face the other (7.5, 10.1). Checks the WT rules against the January 2026 edition and the June 2026 amendments: the boundary penalty is a foot crossing the line, the tie-break order and start marks are set, and the June changes are an open decision (8.3, 8.4, 18.1). Instructor feedback: sets the protector impact threshold at 30 (8.3) and states the December capture fallback in one sentence (19).</w:t>
             </w:r>
           </w:p>
         </w:tc>

</xml_diff>